<commit_message>
fix(ocorrencia): finalizada fica fora da tela inicial e dos mapas
Aparece só na listagem do Super Administrador. Filtro de status salvo
como Finalizada na tela inicial é limpo.
</commit_message>
<xml_diff>
--- a/FAI-SI-PFC-II-FalaCidade-2026-v1.16.docx
+++ b/FAI-SI-PFC-II-FalaCidade-2026-v1.16.docx
@@ -15151,7 +15151,7 @@
         </w:rPr>
       </w:pPr>
       <w:r>
-        <w:t xml:space="preserve">Descrição: o sistema deverá exibir as ocorrências registradas em um mapa geográfico interativo, utilizando a API do  OpenStreetMap, permitindo que administradores e funcionários visualizem a distribuição espacial dos problemas urbanos por bairro, categoria e status. O ciclo de vida da ocorrência no mapa segue os seguintes estados: (1) Pendente — ocorrência recém-registrada, exibida em vermelho no mapa; (2) Em Andamento — ocorrência em atendimento pela secretaria responsável, exibida em amarelo; (3) Concluída — intervenção concluída, exibida em verde; (4) Indeferida — ocorrência não atendida com justificativa, exibida em cinza; (5) Finalizada — ocorrência excluída pelo Super Administrador (RF25), em caráter definitivo, exibida em preto e visível apenas a esse perfil. A transição entre estados é realizada pelos perfis Funcionário ou Administrador via painel administrativo (RF12), com atualização automática da representação gráfica no mapa; o estado Finalizada, por sua vez, é atribuído exclusivamente pela exclusão da ocorrência. A visualização dispõe ainda de seletor de município, que recorta simultaneamente o mapa, os indicadores da situação das ocorrências e a relação das ocorrências recentes; a seleção de um município desloca o mapa até ele, e a opção “Todos os municípios” restabelece a visão global. O seletor relaciona os municípios que possuem ocorrências registradas, acrescidos do município do cadastro do usuário autenticado e daquele identificado pela localização, ainda que neles não haja ocorrência alguma.</w:t>
+        <w:t xml:space="preserve">Descrição: o sistema deverá exibir as ocorrências registradas em um mapa geográfico interativo, utilizando a API do  OpenStreetMap, permitindo que administradores e funcionários visualizem a distribuição espacial dos problemas urbanos por bairro, categoria e status. O ciclo de vida da ocorrência no mapa segue os seguintes estados: (1) Pendente — ocorrência recém-registrada, exibida em vermelho no mapa; (2) Em Andamento — ocorrência em atendimento pela secretaria responsável, exibida em amarelo; (3) Concluída — intervenção concluída, exibida em verde; (4) Indeferida — ocorrência não atendida com justificativa, exibida em cinza; (5) Finalizada — ocorrência excluída pelo Super Administrador (RF25), em caráter definitivo, que não é exibida no mapa, mas apenas na listagem de ocorrências do Super Administrador, em preto. A transição entre estados é realizada pelos perfis Funcionário ou Administrador via painel administrativo (RF12), com atualização automática da representação gráfica no mapa; o estado Finalizada, por sua vez, é atribuído exclusivamente pela exclusão da ocorrência. A visualização dispõe ainda de seletor de município, que recorta simultaneamente o mapa, os indicadores da situação das ocorrências e a relação das ocorrências recentes; a seleção de um município desloca o mapa até ele, e a opção “Todos os municípios” restabelece a visão global. O seletor relaciona os municípios que possuem ocorrências registradas, acrescidos do município do cadastro do usuário autenticado e daquele identificado pela localização, ainda que neles não haja ocorrência alguma.</w:t>
       </w:r>
       <w:ins w:id="9" w:author="Rodrigo Romano" w:date="2026-06-19T00:00:00Z">
         <w:r/>
@@ -15286,7 +15286,7 @@
         <w:rPr/>
       </w:pPr>
       <w:r>
-        <w:t xml:space="preserve">Descrição: o sistema deverá dispor do perfil Super Administrador, sem vinculação a município e responsável pela administração do sistema como um todo. Compete-lhe criar contas de qualquer perfil — inclusive de outros Super Administradores e dos administradores municipais —, indicar o município de cada administrador, administrar qualquer conta e acessar, sem restrição territorial, as ocorrências, os departamentos e os relatórios de todos os municípios atendidos. Compete-lhe ainda, com exclusividade, a exclusão de ocorrências, precedida de caixa de diálogo de confirmação que exibe o protocolo e o título da ocorrência e adverte sobre a irreversibilidade da ação; a permissão é verificada no servidor, que recusa a operação a qualquer outro perfil e à requisição sem autenticação. A exclusão é lógica: a ocorrência não é apagada da base de dados, mas passa ao status “Finalizada”, com o registro da mudança no histórico de trâmite; as fotografias são removidas do serviço de armazenamento de mídias e da base de dados, ao passo que os apoios, o histórico e o vínculo com o grupo são preservados. O autor identificado é notificado por correio eletrônico de que a ocorrência foi excluída pela administração e deixou de ser exibida no aplicativo, e a exclusão é registrada na tela de logs com a identificação do autor, do protocolo, do título e do município. A ocorrência finalizada é visível apenas ao Super Administrador, na listagem, no mapa e nas estatísticas; para os demais perfis, inclusive o próprio autor, e para os visitantes, deixa de figurar nas listagens, no mapa, nas estatísticas, no grupo e no histórico, e as consultas pelo identificador, pelo protocolo ou pelo código de acompanhamento anônimo informam que a ocorrência não foi encontrada. O status “Finalizada” é definitivo: a ocorrência finalizada não pode ser reaberta nem ter o status alterado, inclusive pela atualização coletiva do grupo, que a desconsidera, e esse status não pode ser atribuído pela alteração de status comum, mas somente pela exclusão. O administrador municipal, por sua vez, atua exclusivamente no município que lhe foi atribuído: trata as suas ocorrências, cadastra os seus departamentos e administra as contas a ele vinculadas, incluída a criação de funcionários, vedada a criação ou a alteração de contas de administrador. A primeira conta de Super Administrador é a conta de origem do sistema, promovida na migração da base de dados.</w:t>
+        <w:t xml:space="preserve">Descrição: o sistema deverá dispor do perfil Super Administrador, sem vinculação a município e responsável pela administração do sistema como um todo. Compete-lhe criar contas de qualquer perfil — inclusive de outros Super Administradores e dos administradores municipais —, indicar o município de cada administrador, administrar qualquer conta e acessar, sem restrição territorial, as ocorrências, os departamentos e os relatórios de todos os municípios atendidos. Compete-lhe ainda, com exclusividade, a exclusão de ocorrências, precedida de caixa de diálogo de confirmação que exibe o protocolo e o título da ocorrência e adverte sobre a irreversibilidade da ação; a permissão é verificada no servidor, que recusa a operação a qualquer outro perfil e à requisição sem autenticação. A exclusão é lógica: a ocorrência não é apagada da base de dados, mas passa ao status “Finalizada”, com o registro da mudança no histórico de trâmite; as fotografias são removidas do serviço de armazenamento de mídias e da base de dados, ao passo que os apoios, o histórico e o vínculo com o grupo são preservados. O autor identificado é notificado por correio eletrônico de que a ocorrência foi excluída pela administração e deixou de ser exibida no aplicativo, e a exclusão é registrada na tela de logs com a identificação do autor, do protocolo, do título e do município. A ocorrência finalizada é visível apenas ao Super Administrador, na listagem e nas estatísticas, e não figura na tela inicial nem nos mapas, nem mesmo para ele; para os demais perfis, inclusive o próprio autor, e para os visitantes, deixa de figurar nas listagens, nas estatísticas, no grupo e no histórico, e as consultas pelo identificador, pelo protocolo ou pelo código de acompanhamento anônimo informam que a ocorrência não foi encontrada. O status “Finalizada” é definitivo: a ocorrência finalizada não pode ser reaberta nem ter o status alterado, inclusive pela atualização coletiva do grupo, que a desconsidera, e esse status não pode ser atribuído pela alteração de status comum, mas somente pela exclusão. O administrador municipal, por sua vez, atua exclusivamente no município que lhe foi atribuído: trata as suas ocorrências, cadastra os seus departamentos e administra as contas a ele vinculadas, incluída a criação de funcionários, vedada a criação ou a alteração de contas de administrador. A primeira conta de Super Administrador é a conta de origem do sistema, promovida na migração da base de dados.</w:t>
       </w:r>
     </w:p>
     <w:p>

</xml_diff>